<commit_message>
Added changes to the database
</commit_message>
<xml_diff>
--- a/docs/Passwords/Apex Systems Passwords.docx
+++ b/docs/Passwords/Apex Systems Passwords.docx
@@ -17,6 +17,19 @@
           <w:u w:val="single"/>
         </w:rPr>
         <w:t>Apex Systems Passwords</w:t>
+      </w:r>
+    </w:p>
+    <w:p>
+      <w:pPr>
+        <w:rPr>
+          <w:u w:val="single"/>
+        </w:rPr>
+      </w:pPr>
+      <w:r>
+        <w:rPr>
+          <w:u w:val="single"/>
+        </w:rPr>
+        <w:t>Receptionist</w:t>
       </w:r>
     </w:p>
     <w:tbl>
@@ -154,6 +167,135 @@
         </w:tc>
       </w:tr>
     </w:tbl>
+    <w:p/>
+    <w:p>
+      <w:r>
+        <w:rPr>
+          <w:u w:val="single"/>
+        </w:rPr>
+        <w:t>Doctors</w:t>
+      </w:r>
+    </w:p>
+    <w:tbl>
+      <w:tblPr>
+        <w:tblStyle w:val="TableGrid"/>
+        <w:tblW w:w="0" w:type="auto"/>
+        <w:tblLook w:val="04A0" w:firstRow="1" w:lastRow="0" w:firstColumn="1" w:lastColumn="0" w:noHBand="0" w:noVBand="1"/>
+      </w:tblPr>
+      <w:tblGrid>
+        <w:gridCol w:w="4508"/>
+        <w:gridCol w:w="4508"/>
+      </w:tblGrid>
+      <w:tr>
+        <w:tc>
+          <w:tcPr>
+            <w:tcW w:w="4508" w:type="dxa"/>
+          </w:tcPr>
+          <w:p>
+            <w:pPr>
+              <w:rPr>
+                <w:b/>
+                <w:bCs/>
+              </w:rPr>
+            </w:pPr>
+            <w:r>
+              <w:rPr>
+                <w:b/>
+                <w:bCs/>
+              </w:rPr>
+              <w:t>Username</w:t>
+            </w:r>
+          </w:p>
+        </w:tc>
+        <w:tc>
+          <w:tcPr>
+            <w:tcW w:w="4508" w:type="dxa"/>
+          </w:tcPr>
+          <w:p>
+            <w:r>
+              <w:rPr>
+                <w:b/>
+                <w:bCs/>
+              </w:rPr>
+              <w:t>Password</w:t>
+            </w:r>
+          </w:p>
+        </w:tc>
+      </w:tr>
+      <w:tr>
+        <w:tc>
+          <w:tcPr>
+            <w:tcW w:w="4508" w:type="dxa"/>
+          </w:tcPr>
+          <w:p>
+            <w:proofErr w:type="spellStart"/>
+            <w:r>
+              <w:t>nndlovu</w:t>
+            </w:r>
+            <w:proofErr w:type="spellEnd"/>
+          </w:p>
+        </w:tc>
+        <w:tc>
+          <w:tcPr>
+            <w:tcW w:w="4508" w:type="dxa"/>
+          </w:tcPr>
+          <w:p>
+            <w:r>
+              <w:t>Doctor@123</w:t>
+            </w:r>
+          </w:p>
+        </w:tc>
+      </w:tr>
+      <w:tr>
+        <w:tc>
+          <w:tcPr>
+            <w:tcW w:w="4508" w:type="dxa"/>
+          </w:tcPr>
+          <w:p>
+            <w:proofErr w:type="spellStart"/>
+            <w:r>
+              <w:t>pgovender</w:t>
+            </w:r>
+            <w:proofErr w:type="spellEnd"/>
+          </w:p>
+        </w:tc>
+        <w:tc>
+          <w:tcPr>
+            <w:tcW w:w="4508" w:type="dxa"/>
+          </w:tcPr>
+          <w:p>
+            <w:r>
+              <w:t>Doctor@123</w:t>
+            </w:r>
+          </w:p>
+        </w:tc>
+      </w:tr>
+      <w:tr>
+        <w:tc>
+          <w:tcPr>
+            <w:tcW w:w="4508" w:type="dxa"/>
+          </w:tcPr>
+          <w:p>
+            <w:proofErr w:type="spellStart"/>
+            <w:r>
+              <w:t>pbotha</w:t>
+            </w:r>
+            <w:proofErr w:type="spellEnd"/>
+          </w:p>
+        </w:tc>
+        <w:tc>
+          <w:tcPr>
+            <w:tcW w:w="4508" w:type="dxa"/>
+          </w:tcPr>
+          <w:p>
+            <w:r>
+              <w:t>Doctor@123</w:t>
+            </w:r>
+          </w:p>
+        </w:tc>
+      </w:tr>
+    </w:tbl>
+    <w:p/>
     <w:p/>
     <w:sectPr>
       <w:pgSz w:w="11906" w:h="16838"/>

</xml_diff>

<commit_message>
Proper working navigation bar and user fixes
</commit_message>
<xml_diff>
--- a/docs/Passwords/Apex Systems Passwords.docx
+++ b/docs/Passwords/Apex Systems Passwords.docx
@@ -90,11 +90,9 @@
             <w:tcW w:w="4508" w:type="dxa"/>
           </w:tcPr>
           <w:p>
-            <w:proofErr w:type="spellStart"/>
             <w:r>
               <w:t>tmkhize</w:t>
             </w:r>
-            <w:proofErr w:type="spellEnd"/>
           </w:p>
         </w:tc>
         <w:tc>
@@ -114,11 +112,9 @@
             <w:tcW w:w="4508" w:type="dxa"/>
           </w:tcPr>
           <w:p>
-            <w:proofErr w:type="spellStart"/>
             <w:r>
               <w:t>snaidoo</w:t>
             </w:r>
-            <w:proofErr w:type="spellEnd"/>
           </w:p>
         </w:tc>
         <w:tc>
@@ -143,11 +139,9 @@
             <w:tcW w:w="4508" w:type="dxa"/>
           </w:tcPr>
           <w:p>
-            <w:proofErr w:type="spellStart"/>
             <w:r>
               <w:t>ldlamini</w:t>
             </w:r>
-            <w:proofErr w:type="spellEnd"/>
           </w:p>
         </w:tc>
         <w:tc>
@@ -228,11 +222,9 @@
             <w:tcW w:w="4508" w:type="dxa"/>
           </w:tcPr>
           <w:p>
-            <w:proofErr w:type="spellStart"/>
             <w:r>
               <w:t>nndlovu</w:t>
             </w:r>
-            <w:proofErr w:type="spellEnd"/>
           </w:p>
         </w:tc>
         <w:tc>
@@ -252,11 +244,9 @@
             <w:tcW w:w="4508" w:type="dxa"/>
           </w:tcPr>
           <w:p>
-            <w:proofErr w:type="spellStart"/>
             <w:r>
               <w:t>pgovender</w:t>
             </w:r>
-            <w:proofErr w:type="spellEnd"/>
           </w:p>
         </w:tc>
         <w:tc>
@@ -276,11 +266,9 @@
             <w:tcW w:w="4508" w:type="dxa"/>
           </w:tcPr>
           <w:p>
-            <w:proofErr w:type="spellStart"/>
             <w:r>
               <w:t>pbotha</w:t>
             </w:r>
-            <w:proofErr w:type="spellEnd"/>
           </w:p>
         </w:tc>
         <w:tc>
@@ -296,7 +284,101 @@
       </w:tr>
     </w:tbl>
     <w:p/>
-    <w:p/>
+    <w:p>
+      <w:pPr>
+        <w:rPr>
+          <w:u w:val="single"/>
+        </w:rPr>
+      </w:pPr>
+      <w:r>
+        <w:rPr>
+          <w:u w:val="single"/>
+        </w:rPr>
+        <w:t>Admin</w:t>
+      </w:r>
+    </w:p>
+    <w:tbl>
+      <w:tblPr>
+        <w:tblStyle w:val="TableGrid"/>
+        <w:tblW w:w="0" w:type="auto"/>
+        <w:tblLook w:val="04A0" w:firstRow="1" w:lastRow="0" w:firstColumn="1" w:lastColumn="0" w:noHBand="0" w:noVBand="1"/>
+      </w:tblPr>
+      <w:tblGrid>
+        <w:gridCol w:w="4508"/>
+        <w:gridCol w:w="4508"/>
+      </w:tblGrid>
+      <w:tr>
+        <w:tc>
+          <w:tcPr>
+            <w:tcW w:w="4508" w:type="dxa"/>
+          </w:tcPr>
+          <w:p>
+            <w:pPr>
+              <w:rPr>
+                <w:b/>
+                <w:bCs/>
+              </w:rPr>
+            </w:pPr>
+            <w:r>
+              <w:rPr>
+                <w:b/>
+                <w:bCs/>
+              </w:rPr>
+              <w:t>Username</w:t>
+            </w:r>
+          </w:p>
+        </w:tc>
+        <w:tc>
+          <w:tcPr>
+            <w:tcW w:w="4508" w:type="dxa"/>
+          </w:tcPr>
+          <w:p>
+            <w:pPr>
+              <w:rPr>
+                <w:b/>
+                <w:bCs/>
+              </w:rPr>
+            </w:pPr>
+            <w:r>
+              <w:rPr>
+                <w:b/>
+                <w:bCs/>
+              </w:rPr>
+              <w:t>Password</w:t>
+            </w:r>
+          </w:p>
+        </w:tc>
+      </w:tr>
+      <w:tr>
+        <w:tc>
+          <w:tcPr>
+            <w:tcW w:w="4508" w:type="dxa"/>
+          </w:tcPr>
+          <w:p>
+            <w:r>
+              <w:t>Admin</w:t>
+            </w:r>
+          </w:p>
+        </w:tc>
+        <w:tc>
+          <w:tcPr>
+            <w:tcW w:w="4508" w:type="dxa"/>
+          </w:tcPr>
+          <w:p>
+            <w:r>
+              <w:t>admin</w:t>
+            </w:r>
+          </w:p>
+        </w:tc>
+      </w:tr>
+    </w:tbl>
+    <w:p>
+      <w:pPr>
+        <w:rPr>
+          <w:u w:val="single"/>
+        </w:rPr>
+      </w:pPr>
+    </w:p>
     <w:sectPr>
       <w:pgSz w:w="11906" w:h="16838"/>
       <w:pgMar w:top="1440" w:right="1440" w:bottom="1440" w:left="1440" w:header="708" w:footer="708" w:gutter="0"/>

</xml_diff>